<commit_message>
changed input data to reflect workplan, png download broken
</commit_message>
<xml_diff>
--- a/Dashboard workplan.docx
+++ b/Dashboard workplan.docx
@@ -270,6 +270,18 @@
             </w:pPr>
             <w:r>
               <w:t>Finalize buttons/sliders/inputs</w:t>
+            </w:r>
+          </w:p>
+          <w:p>
+            <w:pPr>
+              <w:pStyle w:val="ListParagraph"/>
+              <w:numPr>
+                <w:ilvl w:val="0"/>
+                <w:numId w:val="2"/>
+              </w:numPr>
+            </w:pPr>
+            <w:r>
+              <w:t>Format structured figure captions</w:t>
             </w:r>
           </w:p>
           <w:p>
@@ -596,18 +608,19 @@
         <w:tblLook w:val="04A0" w:firstRow="1" w:lastRow="0" w:firstColumn="1" w:lastColumn="0" w:noHBand="0" w:noVBand="1"/>
       </w:tblPr>
       <w:tblGrid>
-        <w:gridCol w:w="1168"/>
-        <w:gridCol w:w="1168"/>
+        <w:gridCol w:w="1163"/>
+        <w:gridCol w:w="1164"/>
         <w:gridCol w:w="1380"/>
-        <w:gridCol w:w="989"/>
-        <w:gridCol w:w="1169"/>
-        <w:gridCol w:w="1169"/>
-        <w:gridCol w:w="1169"/>
+        <w:gridCol w:w="986"/>
+        <w:gridCol w:w="1165"/>
+        <w:gridCol w:w="1166"/>
+        <w:gridCol w:w="1165"/>
+        <w:gridCol w:w="1161"/>
       </w:tblGrid>
       <w:tr>
         <w:tc>
           <w:tcPr>
-            <w:tcW w:w="1168" w:type="dxa"/>
+            <w:tcW w:w="1163" w:type="dxa"/>
           </w:tcPr>
           <w:p>
             <w:proofErr w:type="spellStart"/>
@@ -619,7 +632,7 @@
         </w:tc>
         <w:tc>
           <w:tcPr>
-            <w:tcW w:w="1168" w:type="dxa"/>
+            <w:tcW w:w="1164" w:type="dxa"/>
           </w:tcPr>
           <w:p>
             <w:r>
@@ -629,7 +642,7 @@
         </w:tc>
         <w:tc>
           <w:tcPr>
-            <w:tcW w:w="1349" w:type="dxa"/>
+            <w:tcW w:w="1380" w:type="dxa"/>
           </w:tcPr>
           <w:p>
             <w:proofErr w:type="spellStart"/>
@@ -641,7 +654,7 @@
         </w:tc>
         <w:tc>
           <w:tcPr>
-            <w:tcW w:w="989" w:type="dxa"/>
+            <w:tcW w:w="986" w:type="dxa"/>
           </w:tcPr>
           <w:p>
             <w:r>
@@ -651,7 +664,7 @@
         </w:tc>
         <w:tc>
           <w:tcPr>
-            <w:tcW w:w="1169" w:type="dxa"/>
+            <w:tcW w:w="1165" w:type="dxa"/>
           </w:tcPr>
           <w:p>
             <w:r>
@@ -661,7 +674,7 @@
         </w:tc>
         <w:tc>
           <w:tcPr>
-            <w:tcW w:w="1169" w:type="dxa"/>
+            <w:tcW w:w="1166" w:type="dxa"/>
           </w:tcPr>
           <w:p>
             <w:r>
@@ -671,11 +684,21 @@
         </w:tc>
         <w:tc>
           <w:tcPr>
-            <w:tcW w:w="1169" w:type="dxa"/>
+            <w:tcW w:w="1165" w:type="dxa"/>
           </w:tcPr>
           <w:p>
             <w:r>
               <w:t>value</w:t>
+            </w:r>
+          </w:p>
+        </w:tc>
+        <w:tc>
+          <w:tcPr>
+            <w:tcW w:w="1161" w:type="dxa"/>
+          </w:tcPr>
+          <w:p>
+            <w:r>
+              <w:t>units</w:t>
             </w:r>
           </w:p>
         </w:tc>
@@ -683,43 +706,49 @@
       <w:tr>
         <w:tc>
           <w:tcPr>
-            <w:tcW w:w="1168" w:type="dxa"/>
-          </w:tcPr>
-          <w:p/>
-        </w:tc>
-        <w:tc>
-          <w:tcPr>
-            <w:tcW w:w="1168" w:type="dxa"/>
-          </w:tcPr>
-          <w:p/>
-        </w:tc>
-        <w:tc>
-          <w:tcPr>
-            <w:tcW w:w="1349" w:type="dxa"/>
-          </w:tcPr>
-          <w:p/>
-        </w:tc>
-        <w:tc>
-          <w:tcPr>
-            <w:tcW w:w="989" w:type="dxa"/>
-          </w:tcPr>
-          <w:p/>
-        </w:tc>
-        <w:tc>
-          <w:tcPr>
-            <w:tcW w:w="1169" w:type="dxa"/>
-          </w:tcPr>
-          <w:p/>
-        </w:tc>
-        <w:tc>
-          <w:tcPr>
-            <w:tcW w:w="1169" w:type="dxa"/>
-          </w:tcPr>
-          <w:p/>
-        </w:tc>
-        <w:tc>
-          <w:tcPr>
-            <w:tcW w:w="1169" w:type="dxa"/>
+            <w:tcW w:w="1163" w:type="dxa"/>
+          </w:tcPr>
+          <w:p/>
+        </w:tc>
+        <w:tc>
+          <w:tcPr>
+            <w:tcW w:w="1164" w:type="dxa"/>
+          </w:tcPr>
+          <w:p/>
+        </w:tc>
+        <w:tc>
+          <w:tcPr>
+            <w:tcW w:w="1380" w:type="dxa"/>
+          </w:tcPr>
+          <w:p/>
+        </w:tc>
+        <w:tc>
+          <w:tcPr>
+            <w:tcW w:w="986" w:type="dxa"/>
+          </w:tcPr>
+          <w:p/>
+        </w:tc>
+        <w:tc>
+          <w:tcPr>
+            <w:tcW w:w="1165" w:type="dxa"/>
+          </w:tcPr>
+          <w:p/>
+        </w:tc>
+        <w:tc>
+          <w:tcPr>
+            <w:tcW w:w="1166" w:type="dxa"/>
+          </w:tcPr>
+          <w:p/>
+        </w:tc>
+        <w:tc>
+          <w:tcPr>
+            <w:tcW w:w="1165" w:type="dxa"/>
+          </w:tcPr>
+          <w:p/>
+        </w:tc>
+        <w:tc>
+          <w:tcPr>
+            <w:tcW w:w="1161" w:type="dxa"/>
           </w:tcPr>
           <w:p/>
         </w:tc>
@@ -727,49 +756,120 @@
       <w:tr>
         <w:tc>
           <w:tcPr>
-            <w:tcW w:w="1168" w:type="dxa"/>
-          </w:tcPr>
-          <w:p/>
-        </w:tc>
-        <w:tc>
-          <w:tcPr>
-            <w:tcW w:w="1168" w:type="dxa"/>
-          </w:tcPr>
-          <w:p/>
-        </w:tc>
-        <w:tc>
-          <w:tcPr>
-            <w:tcW w:w="1349" w:type="dxa"/>
-          </w:tcPr>
-          <w:p/>
-        </w:tc>
-        <w:tc>
-          <w:tcPr>
-            <w:tcW w:w="989" w:type="dxa"/>
-          </w:tcPr>
-          <w:p/>
-        </w:tc>
-        <w:tc>
-          <w:tcPr>
-            <w:tcW w:w="1169" w:type="dxa"/>
-          </w:tcPr>
-          <w:p/>
-        </w:tc>
-        <w:tc>
-          <w:tcPr>
-            <w:tcW w:w="1169" w:type="dxa"/>
-          </w:tcPr>
-          <w:p/>
-        </w:tc>
-        <w:tc>
-          <w:tcPr>
-            <w:tcW w:w="1169" w:type="dxa"/>
+            <w:tcW w:w="1163" w:type="dxa"/>
+          </w:tcPr>
+          <w:p/>
+        </w:tc>
+        <w:tc>
+          <w:tcPr>
+            <w:tcW w:w="1164" w:type="dxa"/>
+          </w:tcPr>
+          <w:p/>
+        </w:tc>
+        <w:tc>
+          <w:tcPr>
+            <w:tcW w:w="1380" w:type="dxa"/>
+          </w:tcPr>
+          <w:p/>
+        </w:tc>
+        <w:tc>
+          <w:tcPr>
+            <w:tcW w:w="986" w:type="dxa"/>
+          </w:tcPr>
+          <w:p/>
+        </w:tc>
+        <w:tc>
+          <w:tcPr>
+            <w:tcW w:w="1165" w:type="dxa"/>
+          </w:tcPr>
+          <w:p/>
+        </w:tc>
+        <w:tc>
+          <w:tcPr>
+            <w:tcW w:w="1166" w:type="dxa"/>
+          </w:tcPr>
+          <w:p/>
+        </w:tc>
+        <w:tc>
+          <w:tcPr>
+            <w:tcW w:w="1165" w:type="dxa"/>
+          </w:tcPr>
+          <w:p/>
+        </w:tc>
+        <w:tc>
+          <w:tcPr>
+            <w:tcW w:w="1161" w:type="dxa"/>
           </w:tcPr>
           <w:p/>
         </w:tc>
       </w:tr>
     </w:tbl>
     <w:p/>
+    <w:p>
+      <w:pPr>
+        <w:pStyle w:val="Heading2"/>
+      </w:pPr>
+      <w:r>
+        <w:lastRenderedPageBreak/>
+        <w:t>Data Documentation</w:t>
+      </w:r>
+    </w:p>
+    <w:p>
+      <w:r>
+        <w:t xml:space="preserve">Each dataset </w:t>
+      </w:r>
+      <w:r>
+        <w:t>should include:</w:t>
+      </w:r>
+    </w:p>
+    <w:p>
+      <w:pPr>
+        <w:pStyle w:val="ListParagraph"/>
+        <w:numPr>
+          <w:ilvl w:val="0"/>
+          <w:numId w:val="3"/>
+        </w:numPr>
+      </w:pPr>
+      <w:r>
+        <w:t xml:space="preserve">Description - Short description, Years of data available, </w:t>
+      </w:r>
+    </w:p>
+    <w:p>
+      <w:pPr>
+        <w:pStyle w:val="ListParagraph"/>
+        <w:numPr>
+          <w:ilvl w:val="0"/>
+          <w:numId w:val="3"/>
+        </w:numPr>
+      </w:pPr>
+      <w:r>
+        <w:t>Data source – where the data came from, who collects it, who owns/maintains source data</w:t>
+      </w:r>
+    </w:p>
+    <w:p>
+      <w:pPr>
+        <w:pStyle w:val="ListParagraph"/>
+        <w:numPr>
+          <w:ilvl w:val="0"/>
+          <w:numId w:val="3"/>
+        </w:numPr>
+      </w:pPr>
+      <w:r>
+        <w:t>Data extraction - How did we pull that data</w:t>
+      </w:r>
+    </w:p>
+    <w:p>
+      <w:pPr>
+        <w:pStyle w:val="ListParagraph"/>
+        <w:numPr>
+          <w:ilvl w:val="0"/>
+          <w:numId w:val="3"/>
+        </w:numPr>
+      </w:pPr>
+      <w:r>
+        <w:t>Data analysis/processing – did we run any analysis to get the data presented in dashboard</w:t>
+      </w:r>
+    </w:p>
     <w:sectPr>
       <w:pgSz w:w="12240" w:h="15840"/>
       <w:pgMar w:top="1440" w:right="1440" w:bottom="1440" w:left="1440" w:header="720" w:footer="720" w:gutter="0"/>
@@ -1008,11 +1108,103 @@
       </w:rPr>
     </w:lvl>
   </w:abstractNum>
+  <w:abstractNum w:abstractNumId="2" w15:restartNumberingAfterBreak="0">
+    <w:nsid w:val="7B4F6142"/>
+    <w:multiLevelType w:val="hybridMultilevel"/>
+    <w:tmpl w:val="BEC2953C"/>
+    <w:lvl w:ilvl="0" w:tplc="04090011">
+      <w:start w:val="1"/>
+      <w:numFmt w:val="decimal"/>
+      <w:lvlText w:val="%1)"/>
+      <w:lvlJc w:val="left"/>
+      <w:pPr>
+        <w:ind w:left="720" w:hanging="360"/>
+      </w:pPr>
+      <w:rPr>
+        <w:rFonts w:hint="default"/>
+      </w:rPr>
+    </w:lvl>
+    <w:lvl w:ilvl="1" w:tplc="04090019" w:tentative="1">
+      <w:start w:val="1"/>
+      <w:numFmt w:val="lowerLetter"/>
+      <w:lvlText w:val="%2."/>
+      <w:lvlJc w:val="left"/>
+      <w:pPr>
+        <w:ind w:left="1440" w:hanging="360"/>
+      </w:pPr>
+    </w:lvl>
+    <w:lvl w:ilvl="2" w:tplc="0409001B" w:tentative="1">
+      <w:start w:val="1"/>
+      <w:numFmt w:val="lowerRoman"/>
+      <w:lvlText w:val="%3."/>
+      <w:lvlJc w:val="right"/>
+      <w:pPr>
+        <w:ind w:left="2160" w:hanging="180"/>
+      </w:pPr>
+    </w:lvl>
+    <w:lvl w:ilvl="3" w:tplc="0409000F" w:tentative="1">
+      <w:start w:val="1"/>
+      <w:numFmt w:val="decimal"/>
+      <w:lvlText w:val="%4."/>
+      <w:lvlJc w:val="left"/>
+      <w:pPr>
+        <w:ind w:left="2880" w:hanging="360"/>
+      </w:pPr>
+    </w:lvl>
+    <w:lvl w:ilvl="4" w:tplc="04090019" w:tentative="1">
+      <w:start w:val="1"/>
+      <w:numFmt w:val="lowerLetter"/>
+      <w:lvlText w:val="%5."/>
+      <w:lvlJc w:val="left"/>
+      <w:pPr>
+        <w:ind w:left="3600" w:hanging="360"/>
+      </w:pPr>
+    </w:lvl>
+    <w:lvl w:ilvl="5" w:tplc="0409001B" w:tentative="1">
+      <w:start w:val="1"/>
+      <w:numFmt w:val="lowerRoman"/>
+      <w:lvlText w:val="%6."/>
+      <w:lvlJc w:val="right"/>
+      <w:pPr>
+        <w:ind w:left="4320" w:hanging="180"/>
+      </w:pPr>
+    </w:lvl>
+    <w:lvl w:ilvl="6" w:tplc="0409000F" w:tentative="1">
+      <w:start w:val="1"/>
+      <w:numFmt w:val="decimal"/>
+      <w:lvlText w:val="%7."/>
+      <w:lvlJc w:val="left"/>
+      <w:pPr>
+        <w:ind w:left="5040" w:hanging="360"/>
+      </w:pPr>
+    </w:lvl>
+    <w:lvl w:ilvl="7" w:tplc="04090019" w:tentative="1">
+      <w:start w:val="1"/>
+      <w:numFmt w:val="lowerLetter"/>
+      <w:lvlText w:val="%8."/>
+      <w:lvlJc w:val="left"/>
+      <w:pPr>
+        <w:ind w:left="5760" w:hanging="360"/>
+      </w:pPr>
+    </w:lvl>
+    <w:lvl w:ilvl="8" w:tplc="0409001B" w:tentative="1">
+      <w:start w:val="1"/>
+      <w:numFmt w:val="lowerRoman"/>
+      <w:lvlText w:val="%9."/>
+      <w:lvlJc w:val="right"/>
+      <w:pPr>
+        <w:ind w:left="6480" w:hanging="180"/>
+      </w:pPr>
+    </w:lvl>
+  </w:abstractNum>
   <w:num w:numId="1">
     <w:abstractNumId w:val="1"/>
   </w:num>
   <w:num w:numId="2">
     <w:abstractNumId w:val="0"/>
+  </w:num>
+  <w:num w:numId="3">
+    <w:abstractNumId w:val="2"/>
   </w:num>
 </w:numbering>
 </file>
@@ -1838,4 +2030,16 @@
     </a:ext>
   </a:extLst>
 </a:theme>
+</file>
+
+<file path=customXml/item1.xml><?xml version="1.0" encoding="utf-8"?>
+<b:Sources xmlns:b="http://schemas.openxmlformats.org/officeDocument/2006/bibliography" xmlns="http://schemas.openxmlformats.org/officeDocument/2006/bibliography" SelectedStyle="\APASixthEditionOfficeOnline.xsl" StyleName="APA" Version="6"/>
+</file>
+
+<file path=customXml/itemProps1.xml><?xml version="1.0" encoding="utf-8"?>
+<ds:datastoreItem xmlns:ds="http://schemas.openxmlformats.org/officeDocument/2006/customXml" ds:itemID="{D6167DAC-8573-4B5C-BE8C-CDCE1470321E}">
+  <ds:schemaRefs>
+    <ds:schemaRef ds:uri="http://schemas.openxmlformats.org/officeDocument/2006/bibliography"/>
+  </ds:schemaRefs>
+</ds:datastoreItem>
 </file>
</xml_diff>